<commit_message>
chore(templates): regenerate DOCX and generated specs for 0.x.x versions
npm run generate:templates (shared renderer + docx-structure check),
plus the standalone closing-checklist and working-group-list
generators. The due-diligence request list has no generator, so its
embedded version line in word/document.xml was updated in place with
an otherwise byte-preserving zip rewrite.
</commit_message>
<xml_diff>
--- a/content/templates/closing-checklist/template.docx
+++ b/content/templates/closing-checklist/template.docx
@@ -4,7 +4,7 @@
   <w:body>
     <w:p>
       <w:pPr>
-        <w:spacing w:before="240" w:after="210"/>
+        <w:spacing w:after="210" w:before="240"/>
       </w:pPr>
       <w:r>
         <w:rPr>
@@ -18,7 +18,7 @@
     </w:p>
     <w:p>
       <w:pPr>
-        <w:spacing w:before="0" w:after="300"/>
+        <w:spacing w:after="300" w:before="0"/>
       </w:pPr>
       <w:r>
         <w:rPr>
@@ -34,7 +34,7 @@
     </w:p>
     <w:p>
       <w:pPr>
-        <w:spacing w:before="0" w:after="240" w:line="340" w:beforeAutospacing="false" w:afterAutospacing="false"/>
+        <w:spacing w:after="240" w:before="0" w:line="340" w:beforeAutospacing="false" w:afterAutospacing="false"/>
         <w:contextualSpacing w:val="false"/>
       </w:pPr>
       <w:r>
@@ -720,12 +720,12 @@
     </w:tbl>
     <w:p>
       <w:pPr>
-        <w:spacing w:before="200" w:after="0"/>
+        <w:spacing w:after="0" w:before="200"/>
       </w:pPr>
     </w:p>
     <w:p>
       <w:pPr>
-        <w:spacing w:before="0" w:after="240" w:line="340" w:beforeAutospacing="false" w:afterAutospacing="false"/>
+        <w:spacing w:after="240" w:before="0" w:line="340" w:beforeAutospacing="false" w:afterAutospacing="false"/>
         <w:contextualSpacing w:val="false"/>
       </w:pPr>
       <w:r>
@@ -1411,12 +1411,12 @@
     </w:tbl>
     <w:p>
       <w:pPr>
-        <w:spacing w:before="200" w:after="0"/>
+        <w:spacing w:after="0" w:before="200"/>
       </w:pPr>
     </w:p>
     <w:p>
       <w:pPr>
-        <w:spacing w:before="0" w:after="240" w:line="340" w:beforeAutospacing="false" w:afterAutospacing="false"/>
+        <w:spacing w:after="240" w:before="0" w:line="340" w:beforeAutospacing="false" w:afterAutospacing="false"/>
         <w:contextualSpacing w:val="false"/>
       </w:pPr>
       <w:r>
@@ -2101,8 +2101,8 @@
       </w:tr>
     </w:tbl>
     <w:sectPr>
-      <w:headerReference w:type="default" r:id="rId6"/>
-      <w:footerReference w:type="default" r:id="rId7"/>
+      <w:headerReference w:type="default" r:id="rId7"/>
+      <w:footerReference w:type="default" r:id="rId8"/>
       <w:pgSz w:w="15840" w:h="12240" w:orient="landscape"/>
       <w:pgMar w:top="936" w:right="1080" w:bottom="720" w:left="1080" w:header="360" w:footer="432" w:gutter="0"/>
       <w:pgNumType/>
@@ -2110,6 +2110,47 @@
     </w:sectPr>
   </w:body>
 </w:document>
+</file>
+
+<file path=word/comments.xml><?xml version="1.0" encoding="utf-8"?>
+<w:comments xmlns:cx="http://schemas.microsoft.com/office/drawing/2014/chartex" xmlns:cx1="http://schemas.microsoft.com/office/drawing/2015/9/8/chartex" xmlns:cx2="http://schemas.microsoft.com/office/drawing/2015/10/21/chartex" xmlns:cx3="http://schemas.microsoft.com/office/drawing/2016/5/9/chartex" xmlns:cx4="http://schemas.microsoft.com/office/drawing/2016/5/10/chartex" xmlns:cx5="http://schemas.microsoft.com/office/drawing/2016/5/11/chartex" xmlns:cx6="http://schemas.microsoft.com/office/drawing/2016/5/12/chartex" xmlns:cx7="http://schemas.microsoft.com/office/drawing/2016/5/13/chartex" xmlns:cx8="http://schemas.microsoft.com/office/drawing/2016/5/14/chartex" xmlns:mc="http://schemas.openxmlformats.org/markup-compatibility/2006" xmlns:aink="http://schemas.microsoft.com/office/drawing/2016/ink" xmlns:am3d="http://schemas.microsoft.com/office/drawing/2017/model3d" xmlns:o="urn:schemas-microsoft-com:office:office" xmlns:r="http://schemas.openxmlformats.org/officeDocument/2006/relationships" xmlns:m="http://schemas.openxmlformats.org/officeDocument/2006/math" xmlns:v="urn:schemas-microsoft-com:vml" xmlns:wp14="http://schemas.microsoft.com/office/word/2010/wordprocessingDrawing" xmlns:wp="http://schemas.openxmlformats.org/drawingml/2006/wordprocessingDrawing" xmlns:w10="urn:schemas-microsoft-com:office:word" xmlns:w="http://schemas.openxmlformats.org/wordprocessingml/2006/main" xmlns:w14="http://schemas.microsoft.com/office/word/2010/wordml" xmlns:w15="http://schemas.microsoft.com/office/word/2012/wordml" xmlns:w16cex="http://schemas.microsoft.com/office/word/2018/wordml/cex" xmlns:w16cid="http://schemas.microsoft.com/office/word/2016/wordml/cid" xmlns:w16="http://schemas.microsoft.com/office/word/2018/wordml" xmlns:w16sdtdh="http://schemas.microsoft.com/office/word/2020/wordml/sdtdatahash" xmlns:w16se="http://schemas.microsoft.com/office/word/2015/wordml/symex" xmlns:wpg="http://schemas.microsoft.com/office/word/2010/wordprocessingGroup" xmlns:wpi="http://schemas.microsoft.com/office/word/2010/wordprocessingInk" xmlns:wne="http://schemas.microsoft.com/office/word/2006/wordml" xmlns:wps="http://schemas.microsoft.com/office/word/2010/wordprocessingShape"/>
+</file>
+
+<file path=word/endnotes.xml><?xml version="1.0" encoding="utf-8"?>
+<w:endnotes xmlns:wpc="http://schemas.microsoft.com/office/word/2010/wordprocessingCanvas" xmlns:mc="http://schemas.openxmlformats.org/markup-compatibility/2006" xmlns:o="urn:schemas-microsoft-com:office:office" xmlns:r="http://schemas.openxmlformats.org/officeDocument/2006/relationships" xmlns:m="http://schemas.openxmlformats.org/officeDocument/2006/math" xmlns:v="urn:schemas-microsoft-com:vml" xmlns:wp14="http://schemas.microsoft.com/office/word/2010/wordprocessingDrawing" xmlns:wp="http://schemas.openxmlformats.org/drawingml/2006/wordprocessingDrawing" xmlns:w10="urn:schemas-microsoft-com:office:word" xmlns:w="http://schemas.openxmlformats.org/wordprocessingml/2006/main" xmlns:w14="http://schemas.microsoft.com/office/word/2010/wordml" xmlns:w15="http://schemas.microsoft.com/office/word/2012/wordml" xmlns:wpg="http://schemas.microsoft.com/office/word/2010/wordprocessingGroup" xmlns:wpi="http://schemas.microsoft.com/office/word/2010/wordprocessingInk" xmlns:wne="http://schemas.microsoft.com/office/word/2006/wordml" xmlns:wps="http://schemas.microsoft.com/office/word/2010/wordprocessingShape" mc:Ignorable="w14 w15 wp14">
+  <w:endnote w:type="separator" w:id="-1">
+    <w:p>
+      <w:pPr>
+        <w:spacing w:after="0" w:line="240" w:lineRule="auto"/>
+      </w:pPr>
+      <w:r>
+        <w:rPr>
+          <w:rStyle w:val="EndnoteReference"/>
+        </w:rPr>
+        <w:endnoteRef/>
+      </w:r>
+      <w:r>
+        <w:separator/>
+      </w:r>
+    </w:p>
+  </w:endnote>
+  <w:endnote w:type="continuationSeparator" w:id="0">
+    <w:p>
+      <w:pPr>
+        <w:spacing w:after="0" w:line="240" w:lineRule="auto"/>
+      </w:pPr>
+      <w:r>
+        <w:rPr>
+          <w:rStyle w:val="EndnoteReference"/>
+        </w:rPr>
+        <w:endnoteRef/>
+      </w:r>
+      <w:r>
+        <w:continuationSeparator/>
+      </w:r>
+    </w:p>
+  </w:endnote>
+</w:endnotes>
 </file>
 
 <file path=word/footer1.xml><?xml version="1.0" encoding="utf-8"?>
@@ -2127,7 +2168,7 @@
         <w:sz w:val="13"/>
         <w:szCs w:val="13"/>
       </w:rPr>
-      <w:t xml:space="preserve">OpenAgreements Closing Checklist (v1.0). Free to use under CC0 1.0.</w:t>
+      <w:t xml:space="preserve">OpenAgreements Closing Checklist (v0.2.1). Free to use under CC0 1.0.</w:t>
     </w:r>
     <w:r>
       <w:rPr>
@@ -2148,7 +2189,6 @@
       <w:fldChar w:fldCharType="begin"/>
       <w:instrText xml:space="preserve">PAGE</w:instrText>
       <w:fldChar w:fldCharType="separate"/>
-      <w:t>1</w:t>
       <w:fldChar w:fldCharType="end"/>
     </w:r>
     <w:r>
@@ -2170,7 +2210,6 @@
       <w:fldChar w:fldCharType="begin"/>
       <w:instrText xml:space="preserve">NUMPAGES</w:instrText>
       <w:fldChar w:fldCharType="separate"/>
-      <w:t>1</w:t>
       <w:fldChar w:fldCharType="end"/>
     </w:r>
   </w:p>
@@ -2276,7 +2315,7 @@
         </w:tcPr>
         <w:p>
           <w:pPr>
-            <w:spacing w:before="0" w:after="0"/>
+            <w:spacing w:after="0" w:before="0"/>
             <w:jc w:val="right"/>
           </w:pPr>
           <w:r>
@@ -2413,7 +2452,7 @@
     </w:rPrDefault>
     <w:pPrDefault>
       <w:pPr>
-        <w:spacing w:before="0" w:after="0" w:line="340" w:lineRule="auto"/>
+        <w:spacing w:after="0" w:before="0" w:line="340" w:lineRule="auto"/>
       </w:pPr>
     </w:pPrDefault>
   </w:docDefaults>
@@ -2551,12 +2590,49 @@
       <w:szCs w:val="20"/>
     </w:rPr>
   </w:style>
+  <w:style w:type="character" w:styleId="EndnoteReference">
+    <w:name w:val="endnote reference"/>
+    <w:basedOn w:val="DefaultParagraphFont"/>
+    <w:uiPriority w:val="99"/>
+    <w:semiHidden/>
+    <w:unhideWhenUsed/>
+    <w:rPr>
+      <w:vertAlign w:val="superscript"/>
+    </w:rPr>
+  </w:style>
+  <w:style w:type="paragraph" w:styleId="EndnoteText">
+    <w:name w:val="endnote text"/>
+    <w:basedOn w:val="Normal"/>
+    <w:link w:val="EndnoteTextChar"/>
+    <w:uiPriority w:val="99"/>
+    <w:semiHidden/>
+    <w:unhideWhenUsed/>
+    <w:pPr>
+      <w:spacing w:after="0" w:line="240" w:lineRule="auto"/>
+    </w:pPr>
+    <w:rPr>
+      <w:sz w:val="20"/>
+      <w:szCs w:val="20"/>
+    </w:rPr>
+  </w:style>
+  <w:style w:type="character" w:styleId="EndnoteTextChar">
+    <w:name w:val="Endnote Text Char"/>
+    <w:basedOn w:val="DefaultParagraphFont"/>
+    <w:link w:val="EndnoteText"/>
+    <w:uiPriority w:val="99"/>
+    <w:semiHidden/>
+    <w:unhideWhenUsed/>
+    <w:rPr>
+      <w:sz w:val="20"/>
+      <w:szCs w:val="20"/>
+    </w:rPr>
+  </w:style>
   <w:style w:type="paragraph" w:styleId="Normal">
     <w:name w:val="Normal"/>
     <w:next w:val="Normal"/>
     <w:qFormat/>
     <w:pPr>
-      <w:spacing w:before="0" w:after="0" w:line="340" w:lineRule="auto"/>
+      <w:spacing w:after="0" w:before="0" w:line="340" w:lineRule="auto"/>
     </w:pPr>
     <w:rPr>
       <w:rFonts w:ascii="Arial" w:cs="Arial" w:eastAsia="Arial" w:hAnsi="Arial"/>
@@ -2566,299 +2642,4 @@
     </w:rPr>
   </w:style>
 </w:styles>
-</file>
-
-<file path=word/theme/theme1.xml><?xml version="1.0" encoding="utf-8"?>
-<a:theme xmlns:a="http://schemas.openxmlformats.org/drawingml/2006/main" name="Office Theme">
-  <a:themeElements>
-    <a:clrScheme name="Office">
-      <a:dk1>
-        <a:sysClr val="windowText" lastClr="000000"/>
-      </a:dk1>
-      <a:lt1>
-        <a:sysClr val="window" lastClr="FFFFFF"/>
-      </a:lt1>
-      <a:dk2>
-        <a:srgbClr val="44546A"/>
-      </a:dk2>
-      <a:lt2>
-        <a:srgbClr val="E7E6E6"/>
-      </a:lt2>
-      <a:accent1>
-        <a:srgbClr val="4472C4"/>
-      </a:accent1>
-      <a:accent2>
-        <a:srgbClr val="ED7D31"/>
-      </a:accent2>
-      <a:accent3>
-        <a:srgbClr val="A5A5A5"/>
-      </a:accent3>
-      <a:accent4>
-        <a:srgbClr val="FFC000"/>
-      </a:accent4>
-      <a:accent5>
-        <a:srgbClr val="5B9BD5"/>
-      </a:accent5>
-      <a:accent6>
-        <a:srgbClr val="70AD47"/>
-      </a:accent6>
-      <a:hlink>
-        <a:srgbClr val="0563C1"/>
-      </a:hlink>
-      <a:folHlink>
-        <a:srgbClr val="954F72"/>
-      </a:folHlink>
-    </a:clrScheme>
-    <a:fontScheme name="Office">
-      <a:majorFont>
-        <a:latin typeface="Calibri Light" panose="020F0302020204030204"/>
-        <a:ea typeface=""/>
-        <a:cs typeface=""/>
-        <a:font script="Jpan" typeface="游ゴシック Light"/>
-        <a:font script="Hang" typeface="맑은 고딕"/>
-        <a:font script="Hans" typeface="等线 Light"/>
-        <a:font script="Hant" typeface="新細明體"/>
-        <a:font script="Arab" typeface="Times New Roman"/>
-        <a:font script="Hebr" typeface="Times New Roman"/>
-        <a:font script="Thai" typeface="Angsana New"/>
-        <a:font script="Ethi" typeface="Nyala"/>
-        <a:font script="Beng" typeface="Vrinda"/>
-        <a:font script="Gujr" typeface="Shruti"/>
-        <a:font script="Khmr" typeface="MoolBoran"/>
-        <a:font script="Knda" typeface="Tunga"/>
-        <a:font script="Guru" typeface="Raavi"/>
-        <a:font script="Cans" typeface="Euphemia"/>
-        <a:font script="Cher" typeface="Plantagenet Cherokee"/>
-        <a:font script="Yiii" typeface="Microsoft Yi Baiti"/>
-        <a:font script="Tibt" typeface="Microsoft Himalaya"/>
-        <a:font script="Thaa" typeface="MV Boli"/>
-        <a:font script="Deva" typeface="Mangal"/>
-        <a:font script="Telu" typeface="Gautami"/>
-        <a:font script="Taml" typeface="Latha"/>
-        <a:font script="Syrc" typeface="Estrangelo Edessa"/>
-        <a:font script="Orya" typeface="Kalinga"/>
-        <a:font script="Mlym" typeface="Kartika"/>
-        <a:font script="Laoo" typeface="DokChampa"/>
-        <a:font script="Sinh" typeface="Iskoola Pota"/>
-        <a:font script="Mong" typeface="Mongolian Baiti"/>
-        <a:font script="Viet" typeface="Times New Roman"/>
-        <a:font script="Uigh" typeface="Microsoft Uighur"/>
-        <a:font script="Geor" typeface="Sylfaen"/>
-        <a:font script="Armn" typeface="Arial"/>
-        <a:font script="Bugi" typeface="Leelawadee UI"/>
-        <a:font script="Bopo" typeface="Microsoft JhengHei"/>
-        <a:font script="Java" typeface="Javanese Text"/>
-        <a:font script="Lisu" typeface="Segoe UI"/>
-        <a:font script="Mymr" typeface="Myanmar Text"/>
-        <a:font script="Nkoo" typeface="Ebrima"/>
-        <a:font script="Olck" typeface="Nirmala UI"/>
-        <a:font script="Osma" typeface="Ebrima"/>
-        <a:font script="Phag" typeface="Phagspa"/>
-        <a:font script="Syrn" typeface="Estrangelo Edessa"/>
-        <a:font script="Syrj" typeface="Estrangelo Edessa"/>
-        <a:font script="Syre" typeface="Estrangelo Edessa"/>
-        <a:font script="Sora" typeface="Nirmala UI"/>
-        <a:font script="Tale" typeface="Microsoft Tai Le"/>
-        <a:font script="Talu" typeface="Microsoft New Tai Lue"/>
-        <a:font script="Tfng" typeface="Ebrima"/>
-      </a:majorFont>
-      <a:minorFont>
-        <a:latin typeface="Calibri" panose="020F0502020204030204"/>
-        <a:ea typeface=""/>
-        <a:cs typeface=""/>
-        <a:font script="Jpan" typeface="游明朝"/>
-        <a:font script="Hang" typeface="맑은 고딕"/>
-        <a:font script="Hans" typeface="等线"/>
-        <a:font script="Hant" typeface="新細明體"/>
-        <a:font script="Arab" typeface="Arial"/>
-        <a:font script="Hebr" typeface="Arial"/>
-        <a:font script="Thai" typeface="Cordia New"/>
-        <a:font script="Ethi" typeface="Nyala"/>
-        <a:font script="Beng" typeface="Vrinda"/>
-        <a:font script="Gujr" typeface="Shruti"/>
-        <a:font script="Khmr" typeface="DaunPenh"/>
-        <a:font script="Knda" typeface="Tunga"/>
-        <a:font script="Guru" typeface="Raavi"/>
-        <a:font script="Cans" typeface="Euphemia"/>
-        <a:font script="Cher" typeface="Plantagenet Cherokee"/>
-        <a:font script="Yiii" typeface="Microsoft Yi Baiti"/>
-        <a:font script="Tibt" typeface="Microsoft Himalaya"/>
-        <a:font script="Thaa" typeface="MV Boli"/>
-        <a:font script="Deva" typeface="Mangal"/>
-        <a:font script="Telu" typeface="Gautami"/>
-        <a:font script="Taml" typeface="Latha"/>
-        <a:font script="Syrc" typeface="Estrangelo Edessa"/>
-        <a:font script="Orya" typeface="Kalinga"/>
-        <a:font script="Mlym" typeface="Kartika"/>
-        <a:font script="Laoo" typeface="DokChampa"/>
-        <a:font script="Sinh" typeface="Iskoola Pota"/>
-        <a:font script="Mong" typeface="Mongolian Baiti"/>
-        <a:font script="Viet" typeface="Arial"/>
-        <a:font script="Uigh" typeface="Microsoft Uighur"/>
-        <a:font script="Geor" typeface="Sylfaen"/>
-        <a:font script="Armn" typeface="Arial"/>
-        <a:font script="Bugi" typeface="Leelawadee UI"/>
-        <a:font script="Bopo" typeface="Microsoft JhengHei"/>
-        <a:font script="Java" typeface="Javanese Text"/>
-        <a:font script="Lisu" typeface="Segoe UI"/>
-        <a:font script="Mymr" typeface="Myanmar Text"/>
-        <a:font script="Nkoo" typeface="Ebrima"/>
-        <a:font script="Olck" typeface="Nirmala UI"/>
-        <a:font script="Osma" typeface="Ebrima"/>
-        <a:font script="Phag" typeface="Phagspa"/>
-        <a:font script="Syrn" typeface="Estrangelo Edessa"/>
-        <a:font script="Syrj" typeface="Estrangelo Edessa"/>
-        <a:font script="Syre" typeface="Estrangelo Edessa"/>
-        <a:font script="Sora" typeface="Nirmala UI"/>
-        <a:font script="Tale" typeface="Microsoft Tai Le"/>
-        <a:font script="Talu" typeface="Microsoft New Tai Lue"/>
-        <a:font script="Tfng" typeface="Ebrima"/>
-      </a:minorFont>
-    </a:fontScheme>
-    <a:fmtScheme name="Office">
-      <a:fillStyleLst>
-        <a:solidFill>
-          <a:schemeClr val="phClr"/>
-        </a:solidFill>
-        <a:gradFill rotWithShape="1">
-          <a:gsLst>
-            <a:gs pos="0">
-              <a:schemeClr val="phClr">
-                <a:lumMod val="110000"/>
-                <a:satMod val="105000"/>
-                <a:tint val="67000"/>
-              </a:schemeClr>
-            </a:gs>
-            <a:gs pos="50000">
-              <a:schemeClr val="phClr">
-                <a:lumMod val="105000"/>
-                <a:satMod val="103000"/>
-                <a:tint val="73000"/>
-              </a:schemeClr>
-            </a:gs>
-            <a:gs pos="100000">
-              <a:schemeClr val="phClr">
-                <a:lumMod val="105000"/>
-                <a:satMod val="109000"/>
-                <a:tint val="81000"/>
-              </a:schemeClr>
-            </a:gs>
-          </a:gsLst>
-          <a:lin ang="5400000" scaled="0"/>
-        </a:gradFill>
-        <a:gradFill rotWithShape="1">
-          <a:gsLst>
-            <a:gs pos="0">
-              <a:schemeClr val="phClr">
-                <a:satMod val="103000"/>
-                <a:lumMod val="102000"/>
-                <a:tint val="94000"/>
-              </a:schemeClr>
-            </a:gs>
-            <a:gs pos="50000">
-              <a:schemeClr val="phClr">
-                <a:satMod val="110000"/>
-                <a:lumMod val="100000"/>
-                <a:shade val="100000"/>
-              </a:schemeClr>
-            </a:gs>
-            <a:gs pos="100000">
-              <a:schemeClr val="phClr">
-                <a:lumMod val="99000"/>
-                <a:satMod val="120000"/>
-                <a:shade val="78000"/>
-              </a:schemeClr>
-            </a:gs>
-          </a:gsLst>
-          <a:lin ang="5400000" scaled="0"/>
-        </a:gradFill>
-      </a:fillStyleLst>
-      <a:lnStyleLst>
-        <a:ln w="6350" cap="flat" cmpd="sng" algn="ctr">
-          <a:solidFill>
-            <a:schemeClr val="phClr"/>
-          </a:solidFill>
-          <a:prstDash val="solid"/>
-          <a:miter lim="800000"/>
-        </a:ln>
-        <a:ln w="12700" cap="flat" cmpd="sng" algn="ctr">
-          <a:solidFill>
-            <a:schemeClr val="phClr"/>
-          </a:solidFill>
-          <a:prstDash val="solid"/>
-          <a:miter lim="800000"/>
-        </a:ln>
-        <a:ln w="19050" cap="flat" cmpd="sng" algn="ctr">
-          <a:solidFill>
-            <a:schemeClr val="phClr"/>
-          </a:solidFill>
-          <a:prstDash val="solid"/>
-          <a:miter lim="800000"/>
-        </a:ln>
-      </a:lnStyleLst>
-      <a:effectStyleLst>
-        <a:effectStyle>
-          <a:effectLst/>
-        </a:effectStyle>
-        <a:effectStyle>
-          <a:effectLst/>
-        </a:effectStyle>
-        <a:effectStyle>
-          <a:effectLst>
-            <a:outerShdw blurRad="57150" dist="19050" dir="5400000" algn="ctr" rotWithShape="0">
-              <a:srgbClr val="000000">
-                <a:alpha val="63000"/>
-              </a:srgbClr>
-            </a:outerShdw>
-          </a:effectLst>
-        </a:effectStyle>
-      </a:effectStyleLst>
-      <a:bgFillStyleLst>
-        <a:solidFill>
-          <a:schemeClr val="phClr"/>
-        </a:solidFill>
-        <a:solidFill>
-          <a:schemeClr val="phClr">
-            <a:tint val="95000"/>
-            <a:satMod val="170000"/>
-          </a:schemeClr>
-        </a:solidFill>
-        <a:gradFill rotWithShape="1">
-          <a:gsLst>
-            <a:gs pos="0">
-              <a:schemeClr val="phClr">
-                <a:tint val="93000"/>
-                <a:satMod val="150000"/>
-                <a:shade val="98000"/>
-                <a:lumMod val="102000"/>
-              </a:schemeClr>
-            </a:gs>
-            <a:gs pos="50000">
-              <a:schemeClr val="phClr">
-                <a:tint val="98000"/>
-                <a:satMod val="130000"/>
-                <a:shade val="90000"/>
-                <a:lumMod val="103000"/>
-              </a:schemeClr>
-            </a:gs>
-            <a:gs pos="100000">
-              <a:schemeClr val="phClr">
-                <a:shade val="63000"/>
-                <a:satMod val="120000"/>
-              </a:schemeClr>
-            </a:gs>
-          </a:gsLst>
-          <a:lin ang="5400000" scaled="0"/>
-        </a:gradFill>
-      </a:bgFillStyleLst>
-    </a:fmtScheme>
-  </a:themeElements>
-  <a:objectDefaults/>
-  <a:extraClrSchemeLst/>
-  <a:extLst>
-    <a:ext uri="{05A4C25C-085E-4340-85A3-A5531E510DB2}">
-      <thm15:themeFamily xmlns:thm15="http://schemas.microsoft.com/office/thememl/2012/main" name="Office Theme" id="{62F939B6-93AF-4DB8-9C6B-D6C7DFDC589F}" vid="{4A3C46E8-61CC-4603-A589-7422A47A8E4A}"/>
-    </a:ext>
-  </a:extLst>
-</a:theme>
 </file>
</xml_diff>